<commit_message>
Tâm làm chiều 1/7
</commit_message>
<xml_diff>
--- a/Templates/TTr1506/BM-15-06 TỜ TRÌNH XIN CHỦ TRƯƠNG - Templates.docx
+++ b/Templates/TTr1506/BM-15-06 TỜ TRÌNH XIN CHỦ TRƯƠNG - Templates.docx
@@ -673,31 +673,6 @@
         <w:t>Căn cứ:</w:t>
       </w:r>
     </w:p>
-    <w:p>
-      <w:pPr>
-        <w:pStyle w:val="ListParagraph"/>
-        <w:tabs>
-          <w:tab w:val="left" w:pos="284"/>
-        </w:tabs>
-        <w:spacing w:before="60" w:after="60" w:line="276" w:lineRule="auto"/>
-        <w:ind w:left="0" w:firstLine="567"/>
-        <w:contextualSpacing w:val="0"/>
-        <w:jc w:val="both"/>
-        <w:rPr>
-          <w:color w:val="0D0D0D" w:themeColor="text1" w:themeTint="F2"/>
-          <w:sz w:val="28"/>
-          <w:szCs w:val="28"/>
-        </w:rPr>
-      </w:pPr>
-      <w:r>
-        <w:rPr>
-          <w:color w:val="0D0D0D" w:themeColor="text1" w:themeTint="F2"/>
-          <w:sz w:val="28"/>
-          <w:szCs w:val="28"/>
-        </w:rPr>
-        <w:t>Căn cứ;</w:t>
-      </w:r>
-    </w:p>
     <w:sdt>
       <w:sdtPr>
         <w:rPr>
@@ -720,7 +695,7 @@
             <w:tabs>
               <w:tab w:val="left" w:pos="284"/>
             </w:tabs>
-            <w:spacing w:before="60" w:after="60" w:line="276" w:lineRule="auto"/>
+            <w:spacing w:before="60" w:after="60"/>
             <w:ind w:left="0" w:firstLine="567"/>
             <w:contextualSpacing w:val="0"/>
             <w:jc w:val="both"/>
@@ -744,41 +719,6 @@
     <w:p>
       <w:pPr>
         <w:pStyle w:val="ListParagraph"/>
-        <w:tabs>
-          <w:tab w:val="left" w:pos="284"/>
-        </w:tabs>
-        <w:spacing w:before="60" w:after="60" w:line="276" w:lineRule="auto"/>
-        <w:ind w:left="0" w:firstLine="567"/>
-        <w:contextualSpacing w:val="0"/>
-        <w:jc w:val="both"/>
-        <w:rPr>
-          <w:color w:val="0D0D0D" w:themeColor="text1" w:themeTint="F2"/>
-          <w:sz w:val="28"/>
-          <w:szCs w:val="28"/>
-        </w:rPr>
-      </w:pPr>
-      <w:bookmarkStart w:id="2" w:name="_Hlk211541350"/>
-      <w:r>
-        <w:rPr>
-          <w:color w:val="0D0D0D" w:themeColor="text1" w:themeTint="F2"/>
-          <w:sz w:val="28"/>
-          <w:szCs w:val="28"/>
-        </w:rPr>
-        <w:t>Căn cứ yêu cầu hoàn thiện hạ tầng của dự án</w:t>
-      </w:r>
-      <w:r>
-        <w:rPr>
-          <w:color w:val="0D0D0D" w:themeColor="text1" w:themeTint="F2"/>
-          <w:sz w:val="28"/>
-          <w:szCs w:val="28"/>
-        </w:rPr>
-        <w:t>.</w:t>
-      </w:r>
-    </w:p>
-    <w:bookmarkEnd w:id="2"/>
-    <w:p>
-      <w:pPr>
-        <w:pStyle w:val="ListParagraph"/>
         <w:numPr>
           <w:ilvl w:val="0"/>
           <w:numId w:val="2"/>
@@ -805,145 +745,48 @@
         <w:t>Nguyên nhân trình ký:</w:t>
       </w:r>
     </w:p>
-    <w:p>
-      <w:pPr>
-        <w:pStyle w:val="ListParagraph"/>
-        <w:tabs>
-          <w:tab w:val="left" w:pos="284"/>
-        </w:tabs>
-        <w:spacing w:before="60" w:after="60" w:line="276" w:lineRule="auto"/>
-        <w:ind w:left="0" w:firstLine="567"/>
-        <w:contextualSpacing w:val="0"/>
-        <w:jc w:val="both"/>
-        <w:rPr>
-          <w:sz w:val="28"/>
-          <w:szCs w:val="28"/>
-          <w:shd w:val="clear" w:color="auto" w:fill="FFFFFF"/>
-        </w:rPr>
-      </w:pPr>
-      <w:r>
-        <w:rPr>
-          <w:sz w:val="28"/>
-          <w:szCs w:val="28"/>
-          <w:shd w:val="clear" w:color="auto" w:fill="FFFFFF"/>
-        </w:rPr>
-        <w:t>Hiện nay.</w:t>
-      </w:r>
-    </w:p>
-    <w:p>
-      <w:pPr>
-        <w:pStyle w:val="ListParagraph"/>
-        <w:tabs>
-          <w:tab w:val="left" w:pos="284"/>
-        </w:tabs>
-        <w:spacing w:before="60" w:after="60" w:line="276" w:lineRule="auto"/>
-        <w:ind w:left="0" w:firstLine="567"/>
-        <w:contextualSpacing w:val="0"/>
-        <w:jc w:val="both"/>
-        <w:rPr>
-          <w:sz w:val="28"/>
-          <w:szCs w:val="28"/>
-          <w:shd w:val="clear" w:color="auto" w:fill="FFFFFF"/>
-        </w:rPr>
-      </w:pPr>
-      <w:r>
-        <w:rPr>
-          <w:sz w:val="28"/>
-          <w:szCs w:val="28"/>
-          <w:shd w:val="clear" w:color="auto" w:fill="FFFFFF"/>
-        </w:rPr>
-        <w:t>NGUYENNHANTRINHKY</w:t>
-      </w:r>
-    </w:p>
-    <w:p>
-      <w:pPr>
-        <w:spacing w:before="120" w:after="120" w:line="288" w:lineRule="auto"/>
-        <w:ind w:firstLine="426"/>
-        <w:jc w:val="both"/>
-        <w:rPr>
-          <w:sz w:val="28"/>
-          <w:szCs w:val="28"/>
-          <w:lang w:val="fr-FR"/>
-        </w:rPr>
-      </w:pPr>
-      <w:r>
-        <w:rPr>
-          <w:sz w:val="28"/>
-          <w:szCs w:val="28"/>
-          <w:lang w:val="fr-FR"/>
-        </w:rPr>
-        <w:t>Căn cứ kết quả khảo sát hiện trường, nhận thấy khối lượng công việc có phát sinh cụ thể như sau: Tại thời điểm khảo sát, đường D7 (từ nút giao N5-D7 đến nút giao N1-D7) đã thi công đá lớp 2 xong, vì vậy sau khi thực hiện công việc thi công mương cáp băng đường thì đơn vị thi công cần tái lập mặt đường bằng bê tông để đảm bảo kết cấu mặt đường trước khi thảm nhựa, dẫn đến hợp đồng có phát sinh thêm đầu mục công việc cũng như khối lượng tăng so với dự trù đã được phê duyệt.</w:t>
-      </w:r>
-    </w:p>
-    <w:p>
-      <w:pPr>
-        <w:spacing w:before="120" w:after="120" w:line="288" w:lineRule="auto"/>
-        <w:ind w:firstLine="426"/>
-        <w:jc w:val="both"/>
-        <w:rPr>
-          <w:sz w:val="28"/>
-          <w:szCs w:val="28"/>
-          <w:lang w:val="fr-FR"/>
-        </w:rPr>
-      </w:pPr>
-      <w:r>
-        <w:rPr>
-          <w:sz w:val="28"/>
-          <w:szCs w:val="28"/>
-          <w:lang w:val="fr-FR"/>
-        </w:rPr>
-        <w:t>Căn cứ báo giá của đơn vị thi công là NHACUNGCAP ngày 06/05/2026</w:t>
-      </w:r>
-      <w:r>
-        <w:rPr>
-          <w:sz w:val="28"/>
-          <w:szCs w:val="28"/>
-          <w:lang w:val="fr-FR"/>
-        </w:rPr>
-        <w:t>.</w:t>
-      </w:r>
-    </w:p>
-    <w:p>
-      <w:pPr>
-        <w:pStyle w:val="ListParagraph"/>
-        <w:tabs>
-          <w:tab w:val="left" w:pos="284"/>
-        </w:tabs>
-        <w:spacing w:before="60" w:after="60" w:line="276" w:lineRule="auto"/>
-        <w:ind w:left="0" w:firstLine="567"/>
-        <w:contextualSpacing w:val="0"/>
-        <w:jc w:val="both"/>
-        <w:rPr>
-          <w:sz w:val="28"/>
-          <w:szCs w:val="28"/>
-          <w:shd w:val="clear" w:color="auto" w:fill="FFFFFF"/>
-        </w:rPr>
-      </w:pPr>
-      <w:r>
-        <w:rPr>
-          <w:sz w:val="28"/>
-          <w:szCs w:val="28"/>
-          <w:shd w:val="clear" w:color="auto" w:fill="FFFFFF"/>
-        </w:rPr>
-        <w:t>Phòng S</w:t>
-      </w:r>
-      <w:r>
-        <w:rPr>
-          <w:sz w:val="28"/>
-          <w:szCs w:val="28"/>
-          <w:shd w:val="clear" w:color="auto" w:fill="FFFFFF"/>
-        </w:rPr>
-        <w:t>ản xuất Kinh doanh</w:t>
-      </w:r>
-      <w:r>
-        <w:rPr>
-          <w:sz w:val="28"/>
-          <w:szCs w:val="28"/>
-          <w:shd w:val="clear" w:color="auto" w:fill="FFFFFF"/>
-        </w:rPr>
-        <w:t xml:space="preserve"> lập bảng tổng hợp so sánh như sau:</w:t>
-      </w:r>
-    </w:p>
+    <w:sdt>
+      <w:sdtPr>
+        <w:rPr>
+          <w:color w:val="0D0D0D" w:themeColor="text1" w:themeTint="F2"/>
+          <w:sz w:val="28"/>
+          <w:szCs w:val="28"/>
+        </w:rPr>
+        <w:tag w:val="NGUYENNHANTRINHKY"/>
+        <w:id w:val="626983306"/>
+        <w:placeholder>
+          <w:docPart w:val="362D9B4625CF403B9A8E5F59962E2D87"/>
+        </w:placeholder>
+        <w:text/>
+      </w:sdtPr>
+      <w:sdtContent>
+        <w:p>
+          <w:pPr>
+            <w:pStyle w:val="ListParagraph"/>
+            <w:tabs>
+              <w:tab w:val="left" w:pos="284"/>
+            </w:tabs>
+            <w:spacing w:before="60" w:after="60"/>
+            <w:ind w:left="0" w:firstLine="567"/>
+            <w:contextualSpacing w:val="0"/>
+            <w:jc w:val="both"/>
+            <w:rPr>
+              <w:color w:val="0D0D0D" w:themeColor="text1" w:themeTint="F2"/>
+              <w:sz w:val="28"/>
+              <w:szCs w:val="28"/>
+            </w:rPr>
+          </w:pPr>
+          <w:r>
+            <w:rPr>
+              <w:color w:val="0D0D0D" w:themeColor="text1" w:themeTint="F2"/>
+              <w:sz w:val="28"/>
+              <w:szCs w:val="28"/>
+            </w:rPr>
+            <w:t>NGUYENNHANTRINHKY</w:t>
+          </w:r>
+        </w:p>
+      </w:sdtContent>
+    </w:sdt>
     <w:tbl>
       <w:tblPr>
         <w:tblStyle w:val="TableGrid"/>
@@ -1035,7 +878,6 @@
                 <w:sz w:val="28"/>
                 <w:szCs w:val="28"/>
               </w:rPr>
-              <w:lastRenderedPageBreak/>
               <w:t>STT</w:t>
             </w:r>
           </w:p>
@@ -1500,7 +1342,7 @@
                 <w:sz w:val="20"/>
               </w:rPr>
             </w:pPr>
-            <w:bookmarkStart w:id="3" w:name="RANGE!A1:Q18"/>
+            <w:bookmarkStart w:id="2" w:name="RANGE!A1:Q18"/>
             <w:r>
               <w:rPr>
                 <w:b/>
@@ -1509,7 +1351,7 @@
               </w:rPr>
               <w:t>STT</w:t>
             </w:r>
-            <w:bookmarkEnd w:id="3"/>
+            <w:bookmarkEnd w:id="2"/>
           </w:p>
         </w:tc>
         <w:tc>
@@ -2200,6 +2042,7 @@
                 <w:sz w:val="24"/>
                 <w:szCs w:val="24"/>
               </w:rPr>
+              <w:lastRenderedPageBreak/>
               <w:t>1</w:t>
             </w:r>
           </w:p>
@@ -2977,7 +2820,7 @@
           <w:szCs w:val="28"/>
         </w:rPr>
       </w:pPr>
-      <w:bookmarkStart w:id="4" w:name="_Hlk208841315"/>
+      <w:bookmarkStart w:id="3" w:name="_Hlk208841315"/>
       <w:r>
         <w:rPr>
           <w:b/>
@@ -3330,7 +3173,6 @@
                 <w:sz w:val="28"/>
                 <w:szCs w:val="28"/>
               </w:rPr>
-              <w:lastRenderedPageBreak/>
               <w:t>Tài khoản</w:t>
             </w:r>
           </w:p>
@@ -3598,7 +3440,7 @@
         </w:tc>
       </w:tr>
     </w:tbl>
-    <w:bookmarkEnd w:id="4"/>
+    <w:bookmarkEnd w:id="3"/>
     <w:p>
       <w:pPr>
         <w:pStyle w:val="ListParagraph"/>
@@ -3797,6 +3639,7 @@
                 <w:sz w:val="22"/>
                 <w:szCs w:val="22"/>
               </w:rPr>
+              <w:lastRenderedPageBreak/>
               <w:t>STT</w:t>
             </w:r>
           </w:p>
@@ -6103,8 +5946,8 @@
           <w:lang w:val="vi-VN"/>
         </w:rPr>
       </w:pPr>
-      <w:bookmarkStart w:id="5" w:name="_Hlk179633830"/>
-      <w:bookmarkStart w:id="6" w:name="_Hlk179633812"/>
+      <w:bookmarkStart w:id="4" w:name="_Hlk179633830"/>
+      <w:bookmarkStart w:id="5" w:name="_Hlk179633812"/>
       <w:r>
         <w:rPr>
           <w:rFonts w:eastAsia="Calibri"/>
@@ -6115,7 +5958,7 @@
         </w:rPr>
         <w:t>Tổng giá trị Hợp đồng bao gồm toàn bộ các chi phí để Bên B thực hiện công việc theo Hợp đồng</w:t>
       </w:r>
-      <w:bookmarkEnd w:id="5"/>
+      <w:bookmarkEnd w:id="4"/>
       <w:r>
         <w:rPr>
           <w:rFonts w:eastAsia="Calibri"/>
@@ -6245,9 +6088,9 @@
           <w:szCs w:val="28"/>
         </w:rPr>
       </w:pPr>
-      <w:bookmarkStart w:id="7" w:name="_Hlk208842214"/>
-      <w:bookmarkStart w:id="8" w:name="_Hlk208842522"/>
-      <w:bookmarkEnd w:id="6"/>
+      <w:bookmarkStart w:id="6" w:name="_Hlk208842214"/>
+      <w:bookmarkStart w:id="7" w:name="_Hlk208842522"/>
+      <w:bookmarkEnd w:id="5"/>
       <w:r>
         <w:rPr>
           <w:b/>
@@ -6275,10 +6118,10 @@
           <w:szCs w:val="28"/>
         </w:rPr>
       </w:pPr>
-      <w:bookmarkStart w:id="9" w:name="_Hlk168989469"/>
-      <w:bookmarkStart w:id="10" w:name="_Hlk208842484"/>
+      <w:bookmarkStart w:id="8" w:name="_Hlk168989469"/>
+      <w:bookmarkStart w:id="9" w:name="_Hlk208842484"/>
+      <w:bookmarkEnd w:id="6"/>
       <w:bookmarkEnd w:id="7"/>
-      <w:bookmarkEnd w:id="8"/>
       <w:r>
         <w:rPr>
           <w:b/>
@@ -6358,7 +6201,7 @@
         </w:rPr>
         <w:t>)</w:t>
       </w:r>
-      <w:bookmarkEnd w:id="9"/>
+      <w:bookmarkEnd w:id="8"/>
       <w:r>
         <w:rPr>
           <w:sz w:val="28"/>
@@ -6386,7 +6229,6 @@
           <w:sz w:val="28"/>
           <w:szCs w:val="28"/>
         </w:rPr>
-        <w:lastRenderedPageBreak/>
         <w:t xml:space="preserve">Bằng chữ: </w:t>
       </w:r>
       <w:r>
@@ -6434,7 +6276,7 @@
         </w:rPr>
         <w:t xml:space="preserve">Thời gian thực hiện: </w:t>
       </w:r>
-      <w:bookmarkStart w:id="11" w:name="_Hlk179637566"/>
+      <w:bookmarkStart w:id="10" w:name="_Hlk179637566"/>
       <w:r>
         <w:rPr>
           <w:bCs/>
@@ -6491,7 +6333,7 @@
         </w:rPr>
         <w:t xml:space="preserve">bàn giao mặt bằng </w:t>
       </w:r>
-      <w:bookmarkStart w:id="12" w:name="_Hlk204702468"/>
+      <w:bookmarkStart w:id="11" w:name="_Hlk204702468"/>
       <w:r>
         <w:rPr>
           <w:bCs/>
@@ -6500,7 +6342,7 @@
         </w:rPr>
         <w:t>đủ điều kiện thi công</w:t>
       </w:r>
-      <w:bookmarkEnd w:id="12"/>
+      <w:bookmarkEnd w:id="11"/>
       <w:r>
         <w:rPr>
           <w:bCs/>
@@ -6517,9 +6359,9 @@
         </w:rPr>
         <w:t>.</w:t>
       </w:r>
-      <w:bookmarkEnd w:id="11"/>
+      <w:bookmarkEnd w:id="10"/>
     </w:p>
-    <w:bookmarkEnd w:id="10"/>
+    <w:bookmarkEnd w:id="9"/>
     <w:p>
       <w:pPr>
         <w:pStyle w:val="ListParagraph"/>
@@ -6717,7 +6559,7 @@
           <w:shd w:val="clear" w:color="auto" w:fill="FFFFFF"/>
         </w:rPr>
       </w:pPr>
-      <w:bookmarkStart w:id="13" w:name="_Hlk211545573"/>
+      <w:bookmarkStart w:id="12" w:name="_Hlk211545573"/>
       <w:r>
         <w:rPr>
           <w:b/>
@@ -6726,6 +6568,7 @@
           <w:sz w:val="28"/>
           <w:szCs w:val="28"/>
         </w:rPr>
+        <w:lastRenderedPageBreak/>
         <w:t>Đợt 1:</w:t>
       </w:r>
       <w:r>
@@ -7281,7 +7124,6 @@
           <w:sz w:val="28"/>
           <w:szCs w:val="28"/>
         </w:rPr>
-        <w:lastRenderedPageBreak/>
         <w:t>+ Giấy đề nghị thanh toán kết thúc bảo hành;</w:t>
       </w:r>
     </w:p>
@@ -7349,7 +7191,7 @@
         <w:t>.</w:t>
       </w:r>
     </w:p>
-    <w:bookmarkEnd w:id="13"/>
+    <w:bookmarkEnd w:id="12"/>
     <w:p>
       <w:pPr>
         <w:pStyle w:val="ListParagraph"/>
@@ -7529,7 +7371,7 @@
                 <w:lang w:eastAsia="ko-KR"/>
               </w:rPr>
             </w:pPr>
-            <w:bookmarkStart w:id="14" w:name="_Hlk208818503"/>
+            <w:bookmarkStart w:id="13" w:name="_Hlk208818503"/>
             <w:r>
               <w:rPr>
                 <w:b/>
@@ -8084,7 +7926,7 @@
           </w:p>
         </w:tc>
       </w:tr>
-      <w:bookmarkEnd w:id="14"/>
+      <w:bookmarkEnd w:id="13"/>
     </w:tbl>
     <w:p>
       <w:pPr>
@@ -14018,6 +13860,35 @@
         </w:p>
       </w:docPartBody>
     </w:docPart>
+    <w:docPart>
+      <w:docPartPr>
+        <w:name w:val="362D9B4625CF403B9A8E5F59962E2D87"/>
+        <w:category>
+          <w:name w:val="General"/>
+          <w:gallery w:val="placeholder"/>
+        </w:category>
+        <w:types>
+          <w:type w:val="bbPlcHdr"/>
+        </w:types>
+        <w:behaviors>
+          <w:behavior w:val="content"/>
+        </w:behaviors>
+        <w:guid w:val="{7A620578-4BE4-46F0-9B93-1DF5BFEC2EE6}"/>
+      </w:docPartPr>
+      <w:docPartBody>
+        <w:p>
+          <w:pPr>
+            <w:pStyle w:val="362D9B4625CF403B9A8E5F59962E2D87"/>
+          </w:pPr>
+          <w:r>
+            <w:rPr>
+              <w:rStyle w:val="PlaceholderText"/>
+            </w:rPr>
+            <w:t>Click or tap here to enter text.</w:t>
+          </w:r>
+        </w:p>
+      </w:docPartBody>
+    </w:docPart>
   </w:docParts>
 </w:glossaryDocument>
 </file>
@@ -14134,9 +14005,15 @@
   </w:compat>
   <w:rsids>
     <w:rsidRoot w:val="00E2544D"/>
+    <w:rsid w:val="000C69E9"/>
+    <w:rsid w:val="000D6A34"/>
     <w:rsid w:val="003D742F"/>
+    <w:rsid w:val="00500BB9"/>
+    <w:rsid w:val="0062638A"/>
     <w:rsid w:val="008A135C"/>
     <w:rsid w:val="008E1D12"/>
+    <w:rsid w:val="00BC70F4"/>
+    <w:rsid w:val="00DA7ABB"/>
     <w:rsid w:val="00E21176"/>
     <w:rsid w:val="00E2544D"/>
     <w:rsid w:val="00E7583D"/>
@@ -14595,10 +14472,14 @@
     <w:basedOn w:val="DefaultParagraphFont"/>
     <w:uiPriority w:val="99"/>
     <w:semiHidden/>
-    <w:rsid w:val="00E2544D"/>
+    <w:rsid w:val="00500BB9"/>
     <w:rPr>
       <w:color w:val="666666"/>
     </w:rPr>
+  </w:style>
+  <w:style w:type="paragraph" w:customStyle="1" w:styleId="362D9B4625CF403B9A8E5F59962E2D87">
+    <w:name w:val="362D9B4625CF403B9A8E5F59962E2D87"/>
+    <w:rsid w:val="00500BB9"/>
   </w:style>
 </w:styles>
 </file>

</xml_diff>